<commit_message>
improved handbook and voting form
</commit_message>
<xml_diff>
--- a/public/data/zahtev-za-glasanje.docx
+++ b/public/data/zahtev-za-glasanje.docx
@@ -163,18 +163,18 @@
         </w:tblCellMar>
       </w:tblPr>
       <w:tblGrid>
-        <w:gridCol w:w="575"/>
+        <w:gridCol w:w="574"/>
         <w:gridCol w:w="620"/>
-        <w:gridCol w:w="1627"/>
+        <w:gridCol w:w="1628"/>
         <w:gridCol w:w="1532"/>
         <w:gridCol w:w="360"/>
-        <w:gridCol w:w="355"/>
-        <w:gridCol w:w="259"/>
+        <w:gridCol w:w="353"/>
+        <w:gridCol w:w="261"/>
         <w:gridCol w:w="101"/>
         <w:gridCol w:w="362"/>
         <w:gridCol w:w="360"/>
-        <w:gridCol w:w="355"/>
-        <w:gridCol w:w="360"/>
+        <w:gridCol w:w="354"/>
+        <w:gridCol w:w="361"/>
         <w:gridCol w:w="360"/>
         <w:gridCol w:w="362"/>
         <w:gridCol w:w="359"/>
@@ -186,7 +186,7 @@
         <w:trPr/>
         <w:tc>
           <w:tcPr>
-            <w:tcW w:w="575" w:type="dxa"/>
+            <w:tcW w:w="574" w:type="dxa"/>
             <w:tcBorders/>
           </w:tcPr>
           <w:p>
@@ -207,7 +207,7 @@
         </w:tc>
         <w:tc>
           <w:tcPr>
-            <w:tcW w:w="3779" w:type="dxa"/>
+            <w:tcW w:w="3780" w:type="dxa"/>
             <w:gridSpan w:val="3"/>
             <w:tcBorders/>
           </w:tcPr>
@@ -260,7 +260,7 @@
         <w:trPr/>
         <w:tc>
           <w:tcPr>
-            <w:tcW w:w="575" w:type="dxa"/>
+            <w:tcW w:w="574" w:type="dxa"/>
             <w:tcBorders/>
           </w:tcPr>
           <w:p>
@@ -281,7 +281,7 @@
         </w:tc>
         <w:tc>
           <w:tcPr>
-            <w:tcW w:w="3779" w:type="dxa"/>
+            <w:tcW w:w="3780" w:type="dxa"/>
             <w:gridSpan w:val="3"/>
             <w:tcBorders/>
           </w:tcPr>
@@ -331,7 +331,7 @@
         <w:trPr/>
         <w:tc>
           <w:tcPr>
-            <w:tcW w:w="575" w:type="dxa"/>
+            <w:tcW w:w="574" w:type="dxa"/>
             <w:tcBorders/>
           </w:tcPr>
           <w:p>
@@ -354,7 +354,7 @@
         </w:tc>
         <w:tc>
           <w:tcPr>
-            <w:tcW w:w="3779" w:type="dxa"/>
+            <w:tcW w:w="3780" w:type="dxa"/>
             <w:gridSpan w:val="3"/>
             <w:tcBorders/>
           </w:tcPr>
@@ -405,7 +405,7 @@
         <w:trPr/>
         <w:tc>
           <w:tcPr>
-            <w:tcW w:w="575" w:type="dxa"/>
+            <w:tcW w:w="574" w:type="dxa"/>
             <w:tcBorders/>
           </w:tcPr>
           <w:p>
@@ -432,7 +432,7 @@
         </w:tc>
         <w:tc>
           <w:tcPr>
-            <w:tcW w:w="3779" w:type="dxa"/>
+            <w:tcW w:w="3780" w:type="dxa"/>
             <w:gridSpan w:val="3"/>
             <w:tcBorders>
               <w:end w:val="single" w:sz="4" w:space="0" w:color="000000"/>
@@ -487,7 +487,7 @@
         </w:tc>
         <w:tc>
           <w:tcPr>
-            <w:tcW w:w="355" w:type="dxa"/>
+            <w:tcW w:w="353" w:type="dxa"/>
             <w:tcBorders>
               <w:top w:val="single" w:sz="4" w:space="0" w:color="000000"/>
               <w:start w:val="single" w:sz="4" w:space="0" w:color="000000"/>
@@ -519,7 +519,7 @@
         </w:tc>
         <w:tc>
           <w:tcPr>
-            <w:tcW w:w="360" w:type="dxa"/>
+            <w:tcW w:w="362" w:type="dxa"/>
             <w:gridSpan w:val="2"/>
             <w:tcBorders>
               <w:top w:val="single" w:sz="4" w:space="0" w:color="000000"/>
@@ -616,7 +616,7 @@
         </w:tc>
         <w:tc>
           <w:tcPr>
-            <w:tcW w:w="355" w:type="dxa"/>
+            <w:tcW w:w="354" w:type="dxa"/>
             <w:tcBorders>
               <w:top w:val="single" w:sz="4" w:space="0" w:color="000000"/>
               <w:start w:val="single" w:sz="4" w:space="0" w:color="000000"/>
@@ -648,7 +648,7 @@
         </w:tc>
         <w:tc>
           <w:tcPr>
-            <w:tcW w:w="360" w:type="dxa"/>
+            <w:tcW w:w="361" w:type="dxa"/>
             <w:tcBorders>
               <w:top w:val="single" w:sz="4" w:space="0" w:color="000000"/>
               <w:start w:val="single" w:sz="4" w:space="0" w:color="000000"/>
@@ -875,7 +875,7 @@
         <w:trPr/>
         <w:tc>
           <w:tcPr>
-            <w:tcW w:w="575" w:type="dxa"/>
+            <w:tcW w:w="574" w:type="dxa"/>
             <w:tcBorders/>
           </w:tcPr>
           <w:p>
@@ -902,7 +902,7 @@
         </w:tc>
         <w:tc>
           <w:tcPr>
-            <w:tcW w:w="3779" w:type="dxa"/>
+            <w:tcW w:w="3780" w:type="dxa"/>
             <w:gridSpan w:val="3"/>
             <w:tcBorders/>
           </w:tcPr>
@@ -950,7 +950,7 @@
         <w:trPr/>
         <w:tc>
           <w:tcPr>
-            <w:tcW w:w="575" w:type="dxa"/>
+            <w:tcW w:w="574" w:type="dxa"/>
             <w:tcBorders/>
           </w:tcPr>
           <w:p>
@@ -977,7 +977,7 @@
         </w:tc>
         <w:tc>
           <w:tcPr>
-            <w:tcW w:w="3779" w:type="dxa"/>
+            <w:tcW w:w="3780" w:type="dxa"/>
             <w:gridSpan w:val="3"/>
             <w:tcBorders/>
           </w:tcPr>
@@ -1027,7 +1027,7 @@
         </w:trPr>
         <w:tc>
           <w:tcPr>
-            <w:tcW w:w="575" w:type="dxa"/>
+            <w:tcW w:w="574" w:type="dxa"/>
             <w:vMerge w:val="restart"/>
             <w:tcBorders/>
           </w:tcPr>
@@ -1055,7 +1055,7 @@
         </w:tc>
         <w:tc>
           <w:tcPr>
-            <w:tcW w:w="3779" w:type="dxa"/>
+            <w:tcW w:w="3780" w:type="dxa"/>
             <w:gridSpan w:val="3"/>
             <w:vMerge w:val="restart"/>
             <w:tcBorders/>
@@ -1107,7 +1107,7 @@
         </w:trPr>
         <w:tc>
           <w:tcPr>
-            <w:tcW w:w="575" w:type="dxa"/>
+            <w:tcW w:w="574" w:type="dxa"/>
             <w:vMerge w:val="continue"/>
             <w:tcBorders/>
           </w:tcPr>
@@ -1131,7 +1131,7 @@
         </w:tc>
         <w:tc>
           <w:tcPr>
-            <w:tcW w:w="3779" w:type="dxa"/>
+            <w:tcW w:w="3780" w:type="dxa"/>
             <w:gridSpan w:val="3"/>
             <w:vMerge w:val="continue"/>
             <w:tcBorders/>
@@ -1182,7 +1182,7 @@
         <w:trPr/>
         <w:tc>
           <w:tcPr>
-            <w:tcW w:w="575" w:type="dxa"/>
+            <w:tcW w:w="574" w:type="dxa"/>
             <w:tcBorders/>
             <w:tcMar>
               <w:top w:w="0" w:type="dxa"/>
@@ -1207,7 +1207,7 @@
         </w:tc>
         <w:tc>
           <w:tcPr>
-            <w:tcW w:w="8451" w:type="dxa"/>
+            <w:tcW w:w="8452" w:type="dxa"/>
             <w:gridSpan w:val="17"/>
             <w:tcBorders/>
           </w:tcPr>
@@ -1233,7 +1233,7 @@
         </w:trPr>
         <w:tc>
           <w:tcPr>
-            <w:tcW w:w="575" w:type="dxa"/>
+            <w:tcW w:w="574" w:type="dxa"/>
             <w:tcBorders/>
           </w:tcPr>
           <w:p>
@@ -1276,7 +1276,7 @@
         </w:tc>
         <w:tc>
           <w:tcPr>
-            <w:tcW w:w="1627" w:type="dxa"/>
+            <w:tcW w:w="1628" w:type="dxa"/>
             <w:tcBorders>
               <w:bottom w:val="single" w:sz="4" w:space="0" w:color="000000"/>
             </w:tcBorders>
@@ -1334,7 +1334,7 @@
         <w:trPr/>
         <w:tc>
           <w:tcPr>
-            <w:tcW w:w="575" w:type="dxa"/>
+            <w:tcW w:w="574" w:type="dxa"/>
             <w:tcBorders/>
           </w:tcPr>
           <w:p>
@@ -1355,7 +1355,7 @@
         </w:tc>
         <w:tc>
           <w:tcPr>
-            <w:tcW w:w="3779" w:type="dxa"/>
+            <w:tcW w:w="3780" w:type="dxa"/>
             <w:gridSpan w:val="3"/>
             <w:tcBorders/>
           </w:tcPr>
@@ -1398,13 +1398,21 @@
             <w:pPr>
               <w:pStyle w:val="Normal"/>
               <w:snapToGrid w:val="false"/>
-              <w:jc w:val="end"/>
+              <w:jc w:val="start"/>
               <w:rPr>
                 <w:sz w:val="20"/>
                 <w:szCs w:val="20"/>
                 <w:lang w:val="en-US"/>
               </w:rPr>
             </w:pPr>
+            <w:r>
+              <w:rPr>
+                <w:sz w:val="20"/>
+                <w:szCs w:val="20"/>
+                <w:lang w:val="en-US"/>
+              </w:rPr>
+              <w:t xml:space="preserve">                  </w:t>
+            </w:r>
             <w:r>
               <w:rPr>
                 <w:sz w:val="20"/>
@@ -1422,7 +1430,7 @@
         </w:trPr>
         <w:tc>
           <w:tcPr>
-            <w:tcW w:w="575" w:type="dxa"/>
+            <w:tcW w:w="574" w:type="dxa"/>
             <w:tcBorders/>
             <w:tcMar>
               <w:top w:w="0" w:type="dxa"/>
@@ -1451,7 +1459,7 @@
         </w:tc>
         <w:tc>
           <w:tcPr>
-            <w:tcW w:w="4753" w:type="dxa"/>
+            <w:tcW w:w="4754" w:type="dxa"/>
             <w:gridSpan w:val="6"/>
             <w:tcBorders/>
             <w:tcMar>
@@ -1512,7 +1520,7 @@
         <w:trPr/>
         <w:tc>
           <w:tcPr>
-            <w:tcW w:w="575" w:type="dxa"/>
+            <w:tcW w:w="574" w:type="dxa"/>
             <w:tcBorders/>
           </w:tcPr>
           <w:p>
@@ -1537,7 +1545,7 @@
         </w:tc>
         <w:tc>
           <w:tcPr>
-            <w:tcW w:w="3779" w:type="dxa"/>
+            <w:tcW w:w="3780" w:type="dxa"/>
             <w:gridSpan w:val="3"/>
             <w:tcBorders/>
           </w:tcPr>
@@ -1567,12 +1575,19 @@
             <w:pPr>
               <w:pStyle w:val="Normal"/>
               <w:snapToGrid w:val="false"/>
-              <w:jc w:val="end"/>
+              <w:jc w:val="start"/>
               <w:rPr>
                 <w:rFonts w:ascii="Times New Roman" w:hAnsi="Times New Roman" w:cs="Times New Roman"/>
                 <w:lang w:val="en-US"/>
               </w:rPr>
             </w:pPr>
+            <w:r>
+              <w:rPr>
+                <w:rFonts w:cs="Times New Roman" w:ascii="Times New Roman" w:hAnsi="Times New Roman"/>
+                <w:lang w:val="en-US"/>
+              </w:rPr>
+              <w:t xml:space="preserve">               </w:t>
+            </w:r>
             <w:r>
               <w:rPr>
                 <w:rFonts w:cs="Times New Roman" w:ascii="Times New Roman" w:hAnsi="Times New Roman"/>
@@ -1589,7 +1604,7 @@
         </w:trPr>
         <w:tc>
           <w:tcPr>
-            <w:tcW w:w="575" w:type="dxa"/>
+            <w:tcW w:w="574" w:type="dxa"/>
             <w:vMerge w:val="restart"/>
             <w:tcBorders/>
             <w:tcMar>
@@ -1621,7 +1636,7 @@
         </w:tc>
         <w:tc>
           <w:tcPr>
-            <w:tcW w:w="4753" w:type="dxa"/>
+            <w:tcW w:w="4754" w:type="dxa"/>
             <w:gridSpan w:val="6"/>
             <w:vMerge w:val="restart"/>
             <w:tcBorders/>
@@ -1741,7 +1756,7 @@
           <w:p>
             <w:pPr>
               <w:pStyle w:val="Normal"/>
-              <w:jc w:val="end"/>
+              <w:jc w:val="start"/>
               <w:rPr>
                 <w:rFonts w:ascii="Times New Roman" w:hAnsi="Times New Roman" w:cs="Times New Roman"/>
                 <w:sz w:val="20"/>
@@ -1767,7 +1782,7 @@
         </w:trPr>
         <w:tc>
           <w:tcPr>
-            <w:tcW w:w="575" w:type="dxa"/>
+            <w:tcW w:w="574" w:type="dxa"/>
             <w:vMerge w:val="continue"/>
             <w:tcBorders/>
             <w:tcMar>
@@ -1799,7 +1814,7 @@
         </w:tc>
         <w:tc>
           <w:tcPr>
-            <w:tcW w:w="4753" w:type="dxa"/>
+            <w:tcW w:w="4754" w:type="dxa"/>
             <w:gridSpan w:val="6"/>
             <w:vMerge w:val="continue"/>
             <w:tcBorders/>

</xml_diff>